<commit_message>
Semana 8: guion corregido (población dirigida, concordancia, normas con número, beneficios por niveles y nuevo cierre); música resincronizada a 7:50
Co-Authored-By: Claude Opus 5.5 <noreply@anthropic.com>
Claude-Session: https://claude.ai/code/session_01XuLJcNgUM3tZLL1ekwQRQZ
</commit_message>
<xml_diff>
--- a/Actividades/Semana8_Guion_voz_en_off.docx
+++ b/Actividades/Semana8_Guion_voz_en_off.docx
@@ -46,7 +46,7 @@
           <w:sz w:val="22"/>
           <w:szCs w:val="22"/>
         </w:rPr>
-        <w:t xml:space="preserve">Yina Vanessa Cadena Mantilla · Duración total: 7:45 · 24 escenas</w:t>
+        <w:t xml:space="preserve">Yina Vanessa Cadena Mantilla · Duración total: 7:50 · 24 escenas</w:t>
       </w:r>
     </w:p>
     <w:p>
@@ -121,7 +121,7 @@
           <w:sz w:val="22"/>
           <w:szCs w:val="22"/>
         </w:rPr>
-        <w:t xml:space="preserve">el video completo dura 7:45, dentro del rango de 6 a 8 minutos que pide la actividad.</w:t>
+        <w:t xml:space="preserve">el video completo dura 7:50, dentro del rango de 6 a 8 minutos que pide la actividad.</w:t>
       </w:r>
     </w:p>
     <w:p>
@@ -648,7 +648,7 @@
                 <w:sz w:val="18"/>
                 <w:szCs w:val="18"/>
               </w:rPr>
-              <w:t xml:space="preserve">0:10 – 0:30</w:t>
+              <w:t xml:space="preserve">0:10 – 0:35</w:t>
             </w:r>
           </w:p>
         </w:tc>
@@ -682,7 +682,7 @@
                 <w:sz w:val="18"/>
                 <w:szCs w:val="18"/>
               </w:rPr>
-              <w:t xml:space="preserve">Hola, soy Yina Vanessa Cadena Mantilla, estudiante de la Especialización en Gerencia y Auditoría de la Calidad en Salud de UNIMINUTO. En este video presento tres propuestas de prevención para una comunidad rural agrícola, estudiantes universitarios y adultos mayores de un barrio periférico.</w:t>
+              <w:t xml:space="preserve">Hola, soy Yina Vanessa Cadena Mantilla, estudiante de la Especialización en Gerencia y Auditoría de la Calidad en Salud de UNIMINUTO. Este video está dirigido a la comunidad y a los equipos de salud, y presenta propuestas de prevención para una comunidad rural, estudiantes universitarios y adultos mayores.</w:t>
             </w:r>
           </w:p>
         </w:tc>
@@ -824,7 +824,7 @@
                 <w:sz w:val="18"/>
                 <w:szCs w:val="18"/>
               </w:rPr>
-              <w:t xml:space="preserve">0:30 – 0:50</w:t>
+              <w:t xml:space="preserve">0:35 – 0:55</w:t>
             </w:r>
           </w:p>
         </w:tc>
@@ -1000,7 +1000,7 @@
                 <w:sz w:val="18"/>
                 <w:szCs w:val="18"/>
               </w:rPr>
-              <w:t xml:space="preserve">0:50 – 1:10</w:t>
+              <w:t xml:space="preserve">0:55 – 1:15</w:t>
             </w:r>
           </w:p>
         </w:tc>
@@ -1034,7 +1034,7 @@
                 <w:sz w:val="18"/>
                 <w:szCs w:val="18"/>
               </w:rPr>
-              <w:t xml:space="preserve">Estas propuestas se apoyan en normas vigentes: la Ley 1751 de 2015 reconoce la salud como derecho fundamental; la Resolución 3280 de 2018 adopta la Ruta de Promoción y Mantenimiento; y la Resolución 1597 de 2025 regula hoy el Plan de Intervenciones Colectivas.</w:t>
+              <w:t xml:space="preserve">Estas propuestas no parten de cero: la Ley 1751 de 2015 reconoce la salud como un derecho fundamental; la Resolución 3280 de 2018 crea la Ruta de Promoción y Mantenimiento de la Salud; y la Resolución 1597 de 2025 define el Plan de Intervenciones Colectivas.</w:t>
             </w:r>
           </w:p>
         </w:tc>
@@ -1176,7 +1176,7 @@
                 <w:sz w:val="18"/>
                 <w:szCs w:val="18"/>
               </w:rPr>
-              <w:t xml:space="preserve">1:10 – 1:35</w:t>
+              <w:t xml:space="preserve">1:15 – 1:40</w:t>
             </w:r>
           </w:p>
         </w:tc>
@@ -1352,7 +1352,7 @@
                 <w:sz w:val="18"/>
                 <w:szCs w:val="18"/>
               </w:rPr>
-              <w:t xml:space="preserve">1:35 – 1:55</w:t>
+              <w:t xml:space="preserve">1:40 – 2:00</w:t>
             </w:r>
           </w:p>
         </w:tc>
@@ -1528,7 +1528,7 @@
                 <w:sz w:val="18"/>
                 <w:szCs w:val="18"/>
               </w:rPr>
-              <w:t xml:space="preserve">1:55 – 2:15</w:t>
+              <w:t xml:space="preserve">2:00 – 2:20</w:t>
             </w:r>
           </w:p>
         </w:tc>
@@ -1704,7 +1704,7 @@
                 <w:sz w:val="18"/>
                 <w:szCs w:val="18"/>
               </w:rPr>
-              <w:t xml:space="preserve">2:15 – 2:35</w:t>
+              <w:t xml:space="preserve">2:20 – 2:40</w:t>
             </w:r>
           </w:p>
         </w:tc>
@@ -1880,7 +1880,7 @@
                 <w:sz w:val="18"/>
                 <w:szCs w:val="18"/>
               </w:rPr>
-              <w:t xml:space="preserve">2:35 – 2:55</w:t>
+              <w:t xml:space="preserve">2:40 – 3:00</w:t>
             </w:r>
           </w:p>
         </w:tc>
@@ -1914,7 +1914,7 @@
                 <w:sz w:val="18"/>
                 <w:szCs w:val="18"/>
               </w:rPr>
-              <w:t xml:space="preserve">Se financia con el Plan de Intervenciones Colectivas y se apoya en el Código Sanitario y en las normas de calidad del agua. Es viable porque es de bajo costo, pero tiene un reto: la Secretaría de Salud debe incluirla en su plan territorial para que haya recursos.</w:t>
+              <w:t xml:space="preserve">Se financia con el Plan de Intervenciones Colectivas y se apoya en la Ley 9 de 1979 y en la Resolución 2115 de 2007, sobre calidad del agua. Es de bajo costo, pero tiene un reto: la Secretaría de Salud debe incluirla en su plan territorial.</w:t>
             </w:r>
           </w:p>
         </w:tc>
@@ -2056,7 +2056,7 @@
                 <w:sz w:val="18"/>
                 <w:szCs w:val="18"/>
               </w:rPr>
-              <w:t xml:space="preserve">2:55 – 3:20</w:t>
+              <w:t xml:space="preserve">3:00 – 3:25</w:t>
             </w:r>
           </w:p>
         </w:tc>
@@ -2090,7 +2090,7 @@
                 <w:sz w:val="18"/>
                 <w:szCs w:val="18"/>
               </w:rPr>
-              <w:t xml:space="preserve">El segundo caso son estudiantes universitarios de 18 a 25 años que vienen de otras regiones y viven en residencias o viviendas compartidas. En salud, no tienen hábitos de autocuidado; en nutrición, comen comida rápida y toman mucho café y bebidas energéticas; en su entorno, pasan horas frente a pantallas; y en prevención, se mueven poco y duermen mal.</w:t>
+              <w:t xml:space="preserve">El segundo caso es el de estudiantes universitarios de 18 a 25 años que vienen de otras regiones y viven en residencias o viviendas compartidas. En salud, no tienen hábitos de autocuidado; en nutrición, comen comida rápida y toman mucho café y bebidas energéticas; en su entorno, pasan horas frente a pantallas; y en prevención, se mueven poco y duermen mal.</w:t>
             </w:r>
           </w:p>
         </w:tc>
@@ -2232,7 +2232,7 @@
                 <w:sz w:val="18"/>
                 <w:szCs w:val="18"/>
               </w:rPr>
-              <w:t xml:space="preserve">3:20 – 3:40</w:t>
+              <w:t xml:space="preserve">3:25 – 3:45</w:t>
             </w:r>
           </w:p>
         </w:tc>
@@ -2408,7 +2408,7 @@
                 <w:sz w:val="18"/>
                 <w:szCs w:val="18"/>
               </w:rPr>
-              <w:t xml:space="preserve">3:40 – 4:00</w:t>
+              <w:t xml:space="preserve">3:45 – 4:05</w:t>
             </w:r>
           </w:p>
         </w:tc>
@@ -2584,7 +2584,7 @@
                 <w:sz w:val="18"/>
                 <w:szCs w:val="18"/>
               </w:rPr>
-              <w:t xml:space="preserve">4:00 – 4:20</w:t>
+              <w:t xml:space="preserve">4:05 – 4:25</w:t>
             </w:r>
           </w:p>
         </w:tc>
@@ -2760,7 +2760,7 @@
                 <w:sz w:val="18"/>
                 <w:szCs w:val="18"/>
               </w:rPr>
-              <w:t xml:space="preserve">4:20 – 4:40</w:t>
+              <w:t xml:space="preserve">4:25 – 4:45</w:t>
             </w:r>
           </w:p>
         </w:tc>
@@ -2794,7 +2794,7 @@
                 <w:sz w:val="18"/>
                 <w:szCs w:val="18"/>
               </w:rPr>
-              <w:t xml:space="preserve">La respaldan la Resolución 3280 en el momento de juventud, las leyes de obesidad y de etiquetado frontal, la Ley de salud mental y el Decreto 729 de 2025. Es viable porque Bienestar Universitario tiene presupuesto propio; el reto es lograr que los estudiantes participen.</w:t>
+              <w:t xml:space="preserve">La respaldan la Resolución 3280, en la juventud; las leyes 1355, de obesidad, y 2120, de etiquetado frontal; y el Decreto 729 de 2025, de salud mental. Es viable con el presupuesto de Bienestar Universitario; el reto es lograr que los estudiantes participen.</w:t>
             </w:r>
           </w:p>
         </w:tc>
@@ -2936,7 +2936,7 @@
                 <w:sz w:val="18"/>
                 <w:szCs w:val="18"/>
               </w:rPr>
-              <w:t xml:space="preserve">4:40 – 5:05</w:t>
+              <w:t xml:space="preserve">4:45 – 5:10</w:t>
             </w:r>
           </w:p>
         </w:tc>
@@ -2970,7 +2970,7 @@
                 <w:sz w:val="18"/>
                 <w:szCs w:val="18"/>
               </w:rPr>
-              <w:t xml:space="preserve">El tercer caso son adultos mayores de un barrio periférico, con bajos ingresos, y muchos viven solos. En salud, tienen hipertensión y diabetes y no siguen bien sus tratamientos; en nutrición, comen poca proteína, fruta y verdura; en su entorno, las casas tienen pisos resbalosos y poca luz; y en prevención, casi no asisten a los encuentros comunitarios.</w:t>
+              <w:t xml:space="preserve">El tercer caso es el de adultos mayores de un barrio periférico, con bajos ingresos; muchos viven solos. En salud, tienen hipertensión y diabetes y no siguen bien sus tratamientos; en nutrición, comen poca proteína, fruta y verdura; en su entorno, las casas tienen pisos resbalosos y poca luz; y en prevención, casi no asisten a los encuentros comunitarios.</w:t>
             </w:r>
           </w:p>
         </w:tc>
@@ -3112,7 +3112,7 @@
                 <w:sz w:val="18"/>
                 <w:szCs w:val="18"/>
               </w:rPr>
-              <w:t xml:space="preserve">5:05 – 5:25</w:t>
+              <w:t xml:space="preserve">5:10 – 5:30</w:t>
             </w:r>
           </w:p>
         </w:tc>
@@ -3288,7 +3288,7 @@
                 <w:sz w:val="18"/>
                 <w:szCs w:val="18"/>
               </w:rPr>
-              <w:t xml:space="preserve">5:25 – 5:45</w:t>
+              <w:t xml:space="preserve">5:30 – 5:50</w:t>
             </w:r>
           </w:p>
         </w:tc>
@@ -3464,7 +3464,7 @@
                 <w:sz w:val="18"/>
                 <w:szCs w:val="18"/>
               </w:rPr>
-              <w:t xml:space="preserve">5:45 – 6:05</w:t>
+              <w:t xml:space="preserve">5:50 – 6:10</w:t>
             </w:r>
           </w:p>
         </w:tc>
@@ -3640,7 +3640,7 @@
                 <w:sz w:val="18"/>
                 <w:szCs w:val="18"/>
               </w:rPr>
-              <w:t xml:space="preserve">6:05 – 6:25</w:t>
+              <w:t xml:space="preserve">6:10 – 6:30</w:t>
             </w:r>
           </w:p>
         </w:tc>
@@ -3816,7 +3816,7 @@
                 <w:sz w:val="18"/>
                 <w:szCs w:val="18"/>
               </w:rPr>
-              <w:t xml:space="preserve">6:25 – 6:45</w:t>
+              <w:t xml:space="preserve">6:30 – 6:50</w:t>
             </w:r>
           </w:p>
         </w:tc>
@@ -3850,7 +3850,7 @@
                 <w:sz w:val="18"/>
                 <w:szCs w:val="18"/>
               </w:rPr>
-              <w:t xml:space="preserve">¿Cuáles son los beneficios para todos? Prevenir significa menos enfermedades, menos gastos y más calidad de vida. Tratar tarde significa hospitalizaciones, complicaciones, gasto de bolsillo y pérdida de autonomía. Prevenir siempre cuesta menos que tratar una enfermedad avanzada.</w:t>
+              <w:t xml:space="preserve">¿Cuáles son los beneficios para todos? Las personas viven más años con salud y autonomía; las familias gastan menos y tienen menos enfermos que cuidar; y el sistema ahorra hospitalizaciones y tratamientos costosos. Prevenir siempre cuesta menos que tratar una enfermedad avanzada.</w:t>
             </w:r>
           </w:p>
         </w:tc>
@@ -3992,7 +3992,7 @@
                 <w:sz w:val="18"/>
                 <w:szCs w:val="18"/>
               </w:rPr>
-              <w:t xml:space="preserve">6:45 – 7:05</w:t>
+              <w:t xml:space="preserve">6:50 – 7:10</w:t>
             </w:r>
           </w:p>
         </w:tc>
@@ -4168,7 +4168,7 @@
                 <w:sz w:val="18"/>
                 <w:szCs w:val="18"/>
               </w:rPr>
-              <w:t xml:space="preserve">7:05 – 7:25</w:t>
+              <w:t xml:space="preserve">7:10 – 7:30</w:t>
             </w:r>
           </w:p>
         </w:tc>
@@ -4202,7 +4202,7 @@
                 <w:sz w:val="18"/>
                 <w:szCs w:val="18"/>
               </w:rPr>
-              <w:t xml:space="preserve">Cada población necesita una respuesta distinta. Cuando la comunidad, el sistema de salud y el Estado trabajan juntos, la prevención llega a donde vive la gente. Prevenir es cuidar, y cuidar es tarea de todos. Gracias.</w:t>
+              <w:t xml:space="preserve">Prevenir no es esperar a que llegue la enfermedad, es adelantarse a ella. Con acciones sencillas, cercanas y pensadas para cada población, es posible ganar años de vida con salud. Gracias por acompañarme.</w:t>
             </w:r>
           </w:p>
         </w:tc>
@@ -4344,7 +4344,7 @@
                 <w:sz w:val="18"/>
                 <w:szCs w:val="18"/>
               </w:rPr>
-              <w:t xml:space="preserve">7:25 – 7:35</w:t>
+              <w:t xml:space="preserve">7:30 – 7:40</w:t>
             </w:r>
           </w:p>
         </w:tc>
@@ -4520,7 +4520,7 @@
                 <w:sz w:val="18"/>
                 <w:szCs w:val="18"/>
               </w:rPr>
-              <w:t xml:space="preserve">7:35 – 7:45</w:t>
+              <w:t xml:space="preserve">7:40 – 7:50</w:t>
             </w:r>
           </w:p>
         </w:tc>

</xml_diff>